<commit_message>
Update Actividad 7: add RStudio screenshots to report
Add installation and execution screenshots captured from RStudio 2025.05.0
showing bigmemory 4.6.4 and ff 4.5.2 installed and running correctly.

Co-Authored-By: Claude Sonnet 4.6 <noreply@anthropic.com>
</commit_message>
<xml_diff>
--- a/2do-semestre/almacenamiento/tareas/Actividades/R/Actividad 7/Actividad_R_Tarea7_CarlosPulidoRosas.docx
+++ b/2do-semestre/almacenamiento/tareas/Actividades/R/Actividad 7/Actividad_R_Tarea7_CarlosPulidoRosas.docx
@@ -1303,6 +1303,62 @@
     </w:p>
     <w:p>
       <w:pPr>
+        <w:spacing w:before="80" w:after="40"/>
+        <w:jc w:val="center"/>
+      </w:pPr>
+      <w:r>
+        <w:drawing>
+          <wp:inline xmlns:a="http://schemas.openxmlformats.org/drawingml/2006/main" xmlns:pic="http://schemas.openxmlformats.org/drawingml/2006/picture">
+            <wp:extent cx="5303520" cy="2902455"/>
+            <wp:docPr id="2" name="Picture 2"/>
+            <wp:cNvGraphicFramePr>
+              <a:graphicFrameLocks noChangeAspect="1"/>
+            </wp:cNvGraphicFramePr>
+            <a:graphic>
+              <a:graphicData uri="http://schemas.openxmlformats.org/drawingml/2006/picture">
+                <pic:pic>
+                  <pic:nvPicPr>
+                    <pic:cNvPr id="0" name="ss1_instalacion.png"/>
+                    <pic:cNvPicPr/>
+                  </pic:nvPicPr>
+                  <pic:blipFill>
+                    <a:blip r:embed="rId9"/>
+                    <a:stretch>
+                      <a:fillRect/>
+                    </a:stretch>
+                  </pic:blipFill>
+                  <pic:spPr>
+                    <a:xfrm>
+                      <a:off x="0" y="0"/>
+                      <a:ext cx="5303520" cy="2902455"/>
+                    </a:xfrm>
+                    <a:prstGeom prst="rect"/>
+                  </pic:spPr>
+                </pic:pic>
+              </a:graphicData>
+            </a:graphic>
+          </wp:inline>
+        </w:drawing>
+      </w:r>
+    </w:p>
+    <w:p>
+      <w:pPr>
+        <w:spacing w:before="40" w:after="120"/>
+        <w:jc w:val="left"/>
+      </w:pPr>
+      <w:r>
+        <w:rPr>
+          <w:rFonts w:ascii="Calibri" w:hAnsi="Calibri"/>
+          <w:b w:val="0"/>
+          <w:i/>
+          <w:color w:val="404040"/>
+          <w:sz w:val="18"/>
+        </w:rPr>
+        <w:t>Figura 1. Consola de RStudio 2025.05.0 — instalacion completa de bigmemory 4.6.4 y ff 4.5.2 con todas sus dependencias.</w:t>
+      </w:r>
+    </w:p>
+    <w:p>
+      <w:pPr>
         <w:spacing w:before="200" w:after="60"/>
         <w:jc w:val="left"/>
       </w:pPr>
@@ -1468,6 +1524,62 @@
           <w:sz w:val="18"/>
         </w:rPr>
         <w:t>big.matrix de 1,000 x 5 en memoria compartida. Los datos persisten fuera del heap de R.</w:t>
+      </w:r>
+    </w:p>
+    <w:p>
+      <w:pPr>
+        <w:spacing w:before="80" w:after="40"/>
+        <w:jc w:val="center"/>
+      </w:pPr>
+      <w:r>
+        <w:drawing>
+          <wp:inline xmlns:a="http://schemas.openxmlformats.org/drawingml/2006/main" xmlns:pic="http://schemas.openxmlformats.org/drawingml/2006/picture">
+            <wp:extent cx="5303520" cy="2238588"/>
+            <wp:docPr id="3" name="Picture 3"/>
+            <wp:cNvGraphicFramePr>
+              <a:graphicFrameLocks noChangeAspect="1"/>
+            </wp:cNvGraphicFramePr>
+            <a:graphic>
+              <a:graphicData uri="http://schemas.openxmlformats.org/drawingml/2006/picture">
+                <pic:pic>
+                  <pic:nvPicPr>
+                    <pic:cNvPr id="0" name="ss2_ejecucion.png"/>
+                    <pic:cNvPicPr/>
+                  </pic:nvPicPr>
+                  <pic:blipFill>
+                    <a:blip r:embed="rId10"/>
+                    <a:stretch>
+                      <a:fillRect/>
+                    </a:stretch>
+                  </pic:blipFill>
+                  <pic:spPr>
+                    <a:xfrm>
+                      <a:off x="0" y="0"/>
+                      <a:ext cx="5303520" cy="2238588"/>
+                    </a:xfrm>
+                    <a:prstGeom prst="rect"/>
+                  </pic:spPr>
+                </pic:pic>
+              </a:graphicData>
+            </a:graphic>
+          </wp:inline>
+        </w:drawing>
+      </w:r>
+    </w:p>
+    <w:p>
+      <w:pPr>
+        <w:spacing w:before="40" w:after="120"/>
+        <w:jc w:val="left"/>
+      </w:pPr>
+      <w:r>
+        <w:rPr>
+          <w:rFonts w:ascii="Calibri" w:hAnsi="Calibri"/>
+          <w:b w:val="0"/>
+          <w:i/>
+          <w:color w:val="404040"/>
+          <w:sz w:val="18"/>
+        </w:rPr>
+        <w:t>Figura 2. Ejecucion en RStudio — ejemplo de ff: vector de 10,000 enteros, longitud, primeros elementos, suma y tamano en disco (40,000 bytes). Panel Environment muestra bm (big.matrix) y ffv activos.</w:t>
       </w:r>
     </w:p>
     <w:p>

</xml_diff>